<commit_message>
Add VLK report and service characteristic flows, signatories data
Made-with: Cursor
</commit_message>
<xml_diff>
--- a/templates/medical_characteristic_template.docx
+++ b/templates/medical_characteristic_template.docx
@@ -114,49 +114,13 @@
         </w:rPr>
         <w:t xml:space="preserve"> </w:t>
       </w:r>
-      <w:proofErr w:type="spellStart"/>
-      <w:r>
-        <w:rPr>
-          <w:rFonts w:ascii="Times New Roman" w:hAnsi="Times New Roman" w:cs="Times New Roman"/>
-          <w:sz w:val="28"/>
-          <w:szCs w:val="28"/>
-        </w:rPr>
-        <w:t>оперативно</w:t>
-      </w:r>
-      <w:proofErr w:type="spellEnd"/>
-      <w:r>
-        <w:rPr>
-          <w:rFonts w:ascii="Times New Roman" w:hAnsi="Times New Roman" w:cs="Times New Roman"/>
-          <w:sz w:val="28"/>
-          <w:szCs w:val="28"/>
-        </w:rPr>
-        <w:t xml:space="preserve">-тактичного </w:t>
-      </w:r>
-      <w:r>
-        <w:rPr>
-          <w:rFonts w:ascii="Times New Roman" w:hAnsi="Times New Roman" w:cs="Times New Roman"/>
-          <w:sz w:val="28"/>
-          <w:szCs w:val="28"/>
-        </w:rPr>
-        <w:br/>
-        <w:t>з’єднання</w:t>
-      </w:r>
-      <w:r>
-        <w:rPr>
-          <w:rFonts w:ascii="Times New Roman" w:hAnsi="Times New Roman" w:cs="Times New Roman"/>
-          <w:sz w:val="28"/>
-          <w:szCs w:val="28"/>
-          <w:lang w:val="ru-RU"/>
-        </w:rPr>
-        <w:t xml:space="preserve"> – 1</w:t>
-      </w:r>
-      <w:r>
-        <w:rPr>
-          <w:rFonts w:ascii="Times New Roman" w:hAnsi="Times New Roman" w:cs="Times New Roman"/>
-          <w:sz w:val="28"/>
-          <w:szCs w:val="28"/>
-        </w:rPr>
-        <w:t xml:space="preserve"> корпусу Національної гвардії України «Азов»</w:t>
+      <w:r>
+        <w:rPr>
+          <w:rFonts w:ascii="Times New Roman" w:hAnsi="Times New Roman" w:cs="Times New Roman"/>
+          <w:sz w:val="28"/>
+          <w:szCs w:val="28"/>
+        </w:rPr>
+        <w:t xml:space="preserve">Національної гвардії України </w:t>
       </w:r>
     </w:p>
     <w:p>
@@ -644,6 +608,7 @@
           <w:bCs/>
           <w:sz w:val="28"/>
           <w:szCs w:val="28"/>
+          <w:lang w:val="en-US"/>
         </w:rPr>
       </w:pPr>
       <w:r>
@@ -677,6 +642,16 @@
           <w:szCs w:val="28"/>
         </w:rPr>
         <w:t>}}</w:t>
+      </w:r>
+      <w:r>
+        <w:rPr>
+          <w:rFonts w:ascii="Times New Roman" w:hAnsi="Times New Roman" w:cs="Times New Roman"/>
+          <w:b/>
+          <w:bCs/>
+          <w:sz w:val="28"/>
+          <w:szCs w:val="28"/>
+        </w:rPr>
+        <w:t xml:space="preserve"> </w:t>
       </w:r>
       <w:r>
         <w:rPr>
@@ -840,7 +815,15 @@
           <w:sz w:val="28"/>
           <w:szCs w:val="28"/>
         </w:rPr>
-        <w:t>___.___.2025</w:t>
+        <w:t>___.___.202</w:t>
+      </w:r>
+      <w:r>
+        <w:rPr>
+          <w:rFonts w:ascii="Times New Roman" w:hAnsi="Times New Roman" w:cs="Times New Roman"/>
+          <w:sz w:val="28"/>
+          <w:szCs w:val="28"/>
+        </w:rPr>
+        <w:t>6</w:t>
       </w:r>
     </w:p>
     <w:sectPr>

</xml_diff>